<commit_message>
fix(p3): cover letter grammar + framing tightening
Two small fixes after Phase 8 audit:
- "in a extreme-case" → "in an extreme-case" (article agreement)
- "in a digitally mature institutional environment" →
  "in Singapore as an extreme-case, within-context setting of a
  digitally mature economy" (align with manuscript framing)

https://claude.ai/code/session_01Kfe4f9RT1xiN1xvffjyyoW
</commit_message>
<xml_diff>
--- a/papers/p3-singapore/Cover_Letter.docx
+++ b/papers/p3-singapore/Cover_Letter.docx
@@ -31,7 +31,7 @@
         <w:spacing w:after="240"/>
       </w:pPr>
       <w:r>
-        <w:t>This manuscript examines how technological capability and digital adoption shape the internationalization–performance relationship in a digitally mature institutional environment. Using World Bank Enterprise Survey microdata for Singapore 2023 (N = 623), the study develops a two-construct measurement architecture that distinguishes a Technological Capability Index (TCI) from a Digital Adoption Index (DAI), thereby separating firm-internal capability depth from foundational digital interfaces and transaction-enabling mechanisms.</w:t>
+        <w:t>This manuscript examines how technological capability and digital adoption shape the internationalization–performance relationship in Singapore as an extreme-case, within-context setting of a digitally mature economy. Using World Bank Enterprise Survey microdata for Singapore 2023 (N = 623), the study develops a two-construct measurement architecture that distinguishes a Technological Capability Index (TCI) from a Digital Adoption Index (DAI), thereby separating firm-internal capability depth from foundational digital interfaces and transaction-enabling mechanisms.</w:t>
       </w:r>
     </w:p>
     <w:p>
@@ -39,7 +39,7 @@
         <w:spacing w:after="240"/>
       </w:pPr>
       <w:r>
-        <w:t>The manuscript makes three contributions. First, it refines the boundary conditions of the internationalization–performance literature by showing that the classic right-side decline of the curve is not formally identified within the observed export-intensity range in Singapore. Rather than challenging the established nonlinear literature, the findings suggest that, in a extreme-case Singapore setting, the right-side decline may be attenuated or shifted toward sparsely populated levels of export intensity.</w:t>
+        <w:t>The manuscript makes three contributions. First, it refines the boundary conditions of the internationalization–performance literature by showing that the classic right-side decline of the curve is not formally identified within the observed export-intensity range in Singapore. Rather than challenging the established nonlinear literature, the findings suggest that, in an extreme-case Singapore setting, the right-side decline may be attenuated or shifted toward sparsely populated levels of export intensity.</w:t>
       </w:r>
     </w:p>
     <w:p>

</xml_diff>